<commit_message>
updating consent forms and participant info sheet
</commit_message>
<xml_diff>
--- a/documentation/userTesting/Consent form.docx
+++ b/documentation/userTesting/Consent form.docx
@@ -220,41 +220,29 @@
           <w:sz w:val="24"/>
         </w:rPr>
       </w:pPr>
-      <w:proofErr w:type="gramStart"/>
       <w:r>
         <w:rPr>
           <w:rFonts w:ascii="Times New Roman" w:hAnsi="Times New Roman"/>
           <w:color w:val="000000"/>
           <w:sz w:val="28"/>
         </w:rPr>
-        <w:t>”Plan</w:t>
-      </w:r>
-      <w:proofErr w:type="gramEnd"/>
+        <w:t>”</w:t>
+      </w:r>
       <w:r>
         <w:rPr>
           <w:rFonts w:ascii="Times New Roman" w:hAnsi="Times New Roman"/>
           <w:color w:val="000000"/>
           <w:sz w:val="28"/>
         </w:rPr>
-        <w:t xml:space="preserve">-it” – </w:t>
-      </w:r>
-      <w:proofErr w:type="spellStart"/>
+        <w:t>Groove Galaxy</w:t>
+      </w:r>
       <w:r>
         <w:rPr>
           <w:rFonts w:ascii="Times New Roman" w:hAnsi="Times New Roman"/>
           <w:color w:val="000000"/>
           <w:sz w:val="28"/>
         </w:rPr>
-        <w:t>Gameception</w:t>
-      </w:r>
-      <w:proofErr w:type="spellEnd"/>
-      <w:r>
-        <w:rPr>
-          <w:rFonts w:ascii="Times New Roman" w:hAnsi="Times New Roman"/>
-          <w:color w:val="000000"/>
-          <w:sz w:val="28"/>
-        </w:rPr>
-        <w:t xml:space="preserve"> User Testing</w:t>
+        <w:t>” – Gameception User Testing</w:t>
       </w:r>
     </w:p>
     <w:p>
@@ -608,15 +596,7 @@
         <w:spacing w:line="280" w:lineRule="exact"/>
       </w:pPr>
       <w:r>
-        <w:t xml:space="preserve">received enough information about the study for you to </w:t>
-      </w:r>
-      <w:proofErr w:type="gramStart"/>
-      <w:r>
-        <w:t>make a decision</w:t>
-      </w:r>
-      <w:proofErr w:type="gramEnd"/>
-      <w:r>
-        <w:t xml:space="preserve"> </w:t>
+        <w:t xml:space="preserve">received enough information about the study for you to make a decision </w:t>
       </w:r>
     </w:p>
     <w:p>
@@ -1021,15 +1001,7 @@
         <w:spacing w:line="480" w:lineRule="auto"/>
       </w:pPr>
       <w:r>
-        <w:t>Participant’s signature: ____________________________________</w:t>
-      </w:r>
-      <w:proofErr w:type="gramStart"/>
-      <w:r>
-        <w:t>_  Date</w:t>
-      </w:r>
-      <w:proofErr w:type="gramEnd"/>
-      <w:r>
-        <w:t>:  ________________</w:t>
+        <w:t>Participant’s signature: _____________________________________  Date:  ________________</w:t>
       </w:r>
     </w:p>
     <w:p>
@@ -1158,15 +1130,7 @@
         </w:smartTag>
       </w:smartTag>
       <w:r>
-        <w:t xml:space="preserve"> keeping and processing the data I have provided </w:t>
-      </w:r>
-      <w:proofErr w:type="gramStart"/>
-      <w:r>
-        <w:t>during the course of</w:t>
-      </w:r>
-      <w:proofErr w:type="gramEnd"/>
-      <w:r>
-        <w:t xml:space="preserve"> this study. I understand that these data will be used only for the purpose(s) set out in the information sheet, and my consent is conditional upon the University complying with its duties and obligations under the Data Protection Act.</w:t>
+        <w:t xml:space="preserve"> keeping and processing the data I have provided during the course of this study. I understand that these data will be used only for the purpose(s) set out in the information sheet, and my consent is conditional upon the University complying with its duties and obligations under the Data Protection Act.</w:t>
       </w:r>
     </w:p>
     <w:p>
@@ -1203,15 +1167,7 @@
         <w:spacing w:line="480" w:lineRule="auto"/>
       </w:pPr>
       <w:r>
-        <w:t>Participant’s signature: ____________________________________</w:t>
-      </w:r>
-      <w:proofErr w:type="gramStart"/>
-      <w:r>
-        <w:t>_  Date</w:t>
-      </w:r>
-      <w:proofErr w:type="gramEnd"/>
-      <w:r>
-        <w:t>:  ________________</w:t>
+        <w:t>Participant’s signature: _____________________________________  Date:  ________________</w:t>
       </w:r>
     </w:p>
     <w:p>
@@ -1293,7 +1249,10 @@
         <w:t>governance</w:t>
       </w:r>
       <w:r>
-        <w:t>@bristol.ac.uk</w:t>
+        <w:t>@bristol.ac.u</w:t>
+      </w:r>
+      <w:r>
+        <w:t>k)</w:t>
       </w:r>
     </w:p>
     <w:p>
@@ -2269,6 +2228,7 @@
   <w:style w:type="character" w:default="1" w:styleId="DefaultParagraphFont">
     <w:name w:val="Default Paragraph Font"/>
     <w:uiPriority w:val="1"/>
+    <w:semiHidden/>
     <w:unhideWhenUsed/>
   </w:style>
   <w:style w:type="table" w:default="1" w:styleId="TableNormal">
@@ -2765,12 +2725,14 @@
 </file>
 
 <file path=customXml/item1.xml><?xml version="1.0" encoding="utf-8"?>
-<?mso-contentType ?>
-<FormTemplates xmlns="http://schemas.microsoft.com/sharepoint/v3/contenttype/forms">
-  <Display>DocumentLibraryForm</Display>
-  <Edit>DocumentLibraryForm</Edit>
-  <New>DocumentLibraryForm</New>
-</FormTemplates>
+<p:properties xmlns:p="http://schemas.microsoft.com/office/2006/metadata/properties" xmlns:xsi="http://www.w3.org/2001/XMLSchema-instance" xmlns:pc="http://schemas.microsoft.com/office/infopath/2007/PartnerControls">
+  <documentManagement>
+    <TaxCatchAll xmlns="42b74c5b-e541-4f18-8384-2ef592a2a63c" xsi:nil="true"/>
+    <lcf76f155ced4ddcb4097134ff3c332f xmlns="c862ba9a-5266-4cae-9216-87821d726962">
+      <Terms xmlns="http://schemas.microsoft.com/office/infopath/2007/PartnerControls"/>
+    </lcf76f155ced4ddcb4097134ff3c332f>
+  </documentManagement>
+</p:properties>
 </file>
 
 <file path=customXml/item2.xml><?xml version="1.0" encoding="utf-8"?>
@@ -2963,14 +2925,12 @@
 </file>
 
 <file path=customXml/item3.xml><?xml version="1.0" encoding="utf-8"?>
-<p:properties xmlns:p="http://schemas.microsoft.com/office/2006/metadata/properties" xmlns:xsi="http://www.w3.org/2001/XMLSchema-instance" xmlns:pc="http://schemas.microsoft.com/office/infopath/2007/PartnerControls">
-  <documentManagement>
-    <TaxCatchAll xmlns="42b74c5b-e541-4f18-8384-2ef592a2a63c" xsi:nil="true"/>
-    <lcf76f155ced4ddcb4097134ff3c332f xmlns="c862ba9a-5266-4cae-9216-87821d726962">
-      <Terms xmlns="http://schemas.microsoft.com/office/infopath/2007/PartnerControls"/>
-    </lcf76f155ced4ddcb4097134ff3c332f>
-  </documentManagement>
-</p:properties>
+<?mso-contentType ?>
+<FormTemplates xmlns="http://schemas.microsoft.com/sharepoint/v3/contenttype/forms">
+  <Display>DocumentLibraryForm</Display>
+  <Edit>DocumentLibraryForm</Edit>
+  <New>DocumentLibraryForm</New>
+</FormTemplates>
 </file>
 
 <file path=customXml/item4.xml><?xml version="1.0" encoding="utf-8"?>
@@ -2978,9 +2938,12 @@
 </file>
 
 <file path=customXml/itemProps1.xml><?xml version="1.0" encoding="utf-8"?>
-<ds:datastoreItem xmlns:ds="http://schemas.openxmlformats.org/officeDocument/2006/customXml" ds:itemID="{77DE9C55-9BA5-460C-AE5C-94262335E9C4}">
+<ds:datastoreItem xmlns:ds="http://schemas.openxmlformats.org/officeDocument/2006/customXml" ds:itemID="{64A52F05-27F2-4734-A05B-36C43FEBCBF2}">
   <ds:schemaRefs>
-    <ds:schemaRef ds:uri="http://schemas.microsoft.com/sharepoint/v3/contenttype/forms"/>
+    <ds:schemaRef ds:uri="http://schemas.microsoft.com/office/2006/metadata/properties"/>
+    <ds:schemaRef ds:uri="http://schemas.microsoft.com/office/infopath/2007/PartnerControls"/>
+    <ds:schemaRef ds:uri="42b74c5b-e541-4f18-8384-2ef592a2a63c"/>
+    <ds:schemaRef ds:uri="c862ba9a-5266-4cae-9216-87821d726962"/>
   </ds:schemaRefs>
 </ds:datastoreItem>
 </file>
@@ -3005,12 +2968,9 @@
 </file>
 
 <file path=customXml/itemProps3.xml><?xml version="1.0" encoding="utf-8"?>
-<ds:datastoreItem xmlns:ds="http://schemas.openxmlformats.org/officeDocument/2006/customXml" ds:itemID="{64A52F05-27F2-4734-A05B-36C43FEBCBF2}">
+<ds:datastoreItem xmlns:ds="http://schemas.openxmlformats.org/officeDocument/2006/customXml" ds:itemID="{77DE9C55-9BA5-460C-AE5C-94262335E9C4}">
   <ds:schemaRefs>
-    <ds:schemaRef ds:uri="http://schemas.microsoft.com/office/2006/metadata/properties"/>
-    <ds:schemaRef ds:uri="http://schemas.microsoft.com/office/infopath/2007/PartnerControls"/>
-    <ds:schemaRef ds:uri="42b74c5b-e541-4f18-8384-2ef592a2a63c"/>
-    <ds:schemaRef ds:uri="c862ba9a-5266-4cae-9216-87821d726962"/>
+    <ds:schemaRef ds:uri="http://schemas.microsoft.com/sharepoint/v3/contenttype/forms"/>
   </ds:schemaRefs>
 </ds:datastoreItem>
 </file>

</xml_diff>